<commit_message>
new reports with logos
</commit_message>
<xml_diff>
--- a/demo/complaints-output/2025/تقرير تحليل شكاوى المتعاملين2025.docx
+++ b/demo/complaints-output/2025/تقرير تحليل شكاوى المتعاملين2025.docx
@@ -6,22 +6,104 @@
       <w:pPr>
         <w:bidi/>
         <w:spacing w:before="1200"/>
-        <w:rPr>
-          <w:rtl/>
-        </w:rPr>
       </w:pPr>
-    </w:p>
-    <w:p>
-      <w:pPr>
-        <w:bidi/>
-        <w:spacing w:before="1200"/>
-      </w:pPr>
-    </w:p>
-    <w:p>
-      <w:pPr>
-        <w:bidi/>
-        <w:spacing w:before="60" w:after="60"/>
-      </w:pPr>
+      <w:r>
+        <w:drawing>
+          <wp:anchor distT="0" distB="0" distL="114300" distR="114300" simplePos="0" relativeHeight="251663360" behindDoc="1" locked="0" layoutInCell="1" allowOverlap="1" wp14:anchorId="667826AE" wp14:editId="0AB6BD61">
+            <wp:simplePos x="0" y="0"/>
+            <wp:positionH relativeFrom="margin">
+              <wp:align>center</wp:align>
+            </wp:positionH>
+            <wp:positionV relativeFrom="paragraph">
+              <wp:posOffset>888365</wp:posOffset>
+            </wp:positionV>
+            <wp:extent cx="2310765" cy="1518920"/>
+            <wp:effectExtent l="0" t="0" r="0" b="5080"/>
+            <wp:wrapTight wrapText="bothSides">
+              <wp:wrapPolygon edited="0">
+                <wp:start x="9082" y="0"/>
+                <wp:lineTo x="8013" y="1084"/>
+                <wp:lineTo x="6411" y="3522"/>
+                <wp:lineTo x="6411" y="4605"/>
+                <wp:lineTo x="6589" y="8940"/>
+                <wp:lineTo x="6767" y="10836"/>
+                <wp:lineTo x="8369" y="13274"/>
+                <wp:lineTo x="9616" y="13274"/>
+                <wp:lineTo x="0" y="15441"/>
+                <wp:lineTo x="0" y="21401"/>
+                <wp:lineTo x="21012" y="21401"/>
+                <wp:lineTo x="21190" y="21130"/>
+                <wp:lineTo x="20656" y="19776"/>
+                <wp:lineTo x="19054" y="17609"/>
+                <wp:lineTo x="21190" y="17338"/>
+                <wp:lineTo x="20834" y="15441"/>
+                <wp:lineTo x="11218" y="13274"/>
+                <wp:lineTo x="12465" y="13274"/>
+                <wp:lineTo x="14246" y="10565"/>
+                <wp:lineTo x="14780" y="4064"/>
+                <wp:lineTo x="12643" y="813"/>
+                <wp:lineTo x="11753" y="0"/>
+                <wp:lineTo x="9082" y="0"/>
+              </wp:wrapPolygon>
+            </wp:wrapTight>
+            <wp:docPr id="4" name="Picture 3" descr="A logo of a police officer&#10;&#10;AI-generated content may be incorrect.">
+              <a:extLst xmlns:a="http://schemas.openxmlformats.org/drawingml/2006/main">
+                <a:ext uri="{FF2B5EF4-FFF2-40B4-BE49-F238E27FC236}">
+                  <a16:creationId xmlns:a16="http://schemas.microsoft.com/office/drawing/2014/main" id="{17E2D17C-3306-ABCB-BD88-6CCE2E8009C6}"/>
+                </a:ext>
+              </a:extLst>
+            </wp:docPr>
+            <wp:cNvGraphicFramePr>
+              <a:graphicFrameLocks xmlns:a="http://schemas.openxmlformats.org/drawingml/2006/main" noChangeAspect="1"/>
+            </wp:cNvGraphicFramePr>
+            <a:graphic xmlns:a="http://schemas.openxmlformats.org/drawingml/2006/main">
+              <a:graphicData uri="http://schemas.openxmlformats.org/drawingml/2006/picture">
+                <pic:pic xmlns:pic="http://schemas.openxmlformats.org/drawingml/2006/picture">
+                  <pic:nvPicPr>
+                    <pic:cNvPr id="4" name="Picture 3" descr="A logo of a police officer&#10;&#10;AI-generated content may be incorrect.">
+                      <a:extLst>
+                        <a:ext uri="{FF2B5EF4-FFF2-40B4-BE49-F238E27FC236}">
+                          <a16:creationId xmlns:a16="http://schemas.microsoft.com/office/drawing/2014/main" id="{17E2D17C-3306-ABCB-BD88-6CCE2E8009C6}"/>
+                        </a:ext>
+                      </a:extLst>
+                    </pic:cNvPr>
+                    <pic:cNvPicPr>
+                      <a:picLocks noChangeAspect="1"/>
+                    </pic:cNvPicPr>
+                  </pic:nvPicPr>
+                  <pic:blipFill>
+                    <a:blip r:embed="rId7" cstate="print">
+                      <a:extLst>
+                        <a:ext uri="{28A0092B-C50C-407E-A947-70E740481C1C}">
+                          <a14:useLocalDpi xmlns:a14="http://schemas.microsoft.com/office/drawing/2010/main" val="0"/>
+                        </a:ext>
+                      </a:extLst>
+                    </a:blip>
+                    <a:stretch>
+                      <a:fillRect/>
+                    </a:stretch>
+                  </pic:blipFill>
+                  <pic:spPr>
+                    <a:xfrm>
+                      <a:off x="0" y="0"/>
+                      <a:ext cx="2310765" cy="1518920"/>
+                    </a:xfrm>
+                    <a:prstGeom prst="rect">
+                      <a:avLst/>
+                    </a:prstGeom>
+                  </pic:spPr>
+                </pic:pic>
+              </a:graphicData>
+            </a:graphic>
+            <wp14:sizeRelH relativeFrom="page">
+              <wp14:pctWidth>0</wp14:pctWidth>
+            </wp14:sizeRelH>
+            <wp14:sizeRelV relativeFrom="page">
+              <wp14:pctHeight>0</wp14:pctHeight>
+            </wp14:sizeRelV>
+          </wp:anchor>
+        </w:drawing>
+      </w:r>
     </w:p>
     <w:p>
       <w:pPr>
@@ -264,7 +346,23 @@
           <w:color w:val="606060"/>
           <w:rtl/>
         </w:rPr>
-        <w:t>أبريل 2026 | شرطة الفجيرة | تحليل ذكاء الأعمال المتكامل</w:t>
+        <w:t xml:space="preserve">أبريل 2026 | </w:t>
+      </w:r>
+      <w:r>
+        <w:rPr>
+          <w:rFonts w:ascii="Dubai" w:hAnsi="Dubai" w:cs="Dubai" w:hint="cs"/>
+          <w:color w:val="606060"/>
+          <w:rtl/>
+        </w:rPr>
+        <w:t>القيادة العامة ل</w:t>
+      </w:r>
+      <w:r>
+        <w:rPr>
+          <w:rFonts w:ascii="Dubai" w:hAnsi="Dubai" w:cs="Dubai"/>
+          <w:color w:val="606060"/>
+          <w:rtl/>
+        </w:rPr>
+        <w:t>شرطة الفجيرة | تحليل ذكاء الأعمال المتكامل</w:t>
       </w:r>
     </w:p>
     <w:p/>
@@ -323,7 +421,6 @@
           <w:szCs w:val="32"/>
           <w:rtl/>
         </w:rPr>
-        <w:lastRenderedPageBreak/>
         <w:t>جدول المحتويات</w:t>
       </w:r>
     </w:p>
@@ -443,6 +540,7 @@
           <w:szCs w:val="18"/>
         </w:rPr>
       </w:pPr>
+      <w:proofErr w:type="gramStart"/>
       <w:r>
         <w:rPr>
           <w:rFonts w:ascii="Dubai" w:hAnsi="Dubai" w:cs="Dubai"/>
@@ -479,7 +577,18 @@
           <w:szCs w:val="18"/>
           <w:rtl/>
         </w:rPr>
-        <w:t>المصادر المُحلَّلة</w:t>
+        <w:t>المصادر</w:t>
+      </w:r>
+      <w:proofErr w:type="gramEnd"/>
+      <w:r>
+        <w:rPr>
+          <w:rFonts w:ascii="Dubai" w:hAnsi="Dubai" w:cs="Dubai"/>
+          <w:color w:val="606060"/>
+          <w:sz w:val="18"/>
+          <w:szCs w:val="18"/>
+          <w:rtl/>
+        </w:rPr>
+        <w:t xml:space="preserve"> المُحلَّلة</w:t>
       </w:r>
     </w:p>
     <w:p>
@@ -493,6 +602,7 @@
           <w:szCs w:val="18"/>
         </w:rPr>
       </w:pPr>
+      <w:proofErr w:type="gramStart"/>
       <w:r>
         <w:rPr>
           <w:rFonts w:ascii="Dubai" w:hAnsi="Dubai" w:cs="Dubai"/>
@@ -529,7 +639,18 @@
           <w:szCs w:val="18"/>
           <w:rtl/>
         </w:rPr>
-        <w:t>منهجية التصنيف</w:t>
+        <w:t>منهجية</w:t>
+      </w:r>
+      <w:proofErr w:type="gramEnd"/>
+      <w:r>
+        <w:rPr>
+          <w:rFonts w:ascii="Dubai" w:hAnsi="Dubai" w:cs="Dubai"/>
+          <w:color w:val="606060"/>
+          <w:sz w:val="18"/>
+          <w:szCs w:val="18"/>
+          <w:rtl/>
+        </w:rPr>
+        <w:t xml:space="preserve"> التصنيف</w:t>
       </w:r>
     </w:p>
     <w:p>
@@ -543,6 +664,7 @@
           <w:szCs w:val="18"/>
         </w:rPr>
       </w:pPr>
+      <w:proofErr w:type="gramStart"/>
       <w:r>
         <w:rPr>
           <w:rFonts w:ascii="Dubai" w:hAnsi="Dubai" w:cs="Dubai"/>
@@ -579,7 +701,18 @@
           <w:szCs w:val="18"/>
           <w:rtl/>
         </w:rPr>
-        <w:t>الحقول المُحلَّلة</w:t>
+        <w:t>الحقول</w:t>
+      </w:r>
+      <w:proofErr w:type="gramEnd"/>
+      <w:r>
+        <w:rPr>
+          <w:rFonts w:ascii="Dubai" w:hAnsi="Dubai" w:cs="Dubai"/>
+          <w:color w:val="606060"/>
+          <w:sz w:val="18"/>
+          <w:szCs w:val="18"/>
+          <w:rtl/>
+        </w:rPr>
+        <w:t xml:space="preserve"> المُحلَّلة</w:t>
       </w:r>
     </w:p>
     <w:p>
@@ -629,6 +762,7 @@
           <w:szCs w:val="18"/>
         </w:rPr>
       </w:pPr>
+      <w:proofErr w:type="gramStart"/>
       <w:r>
         <w:rPr>
           <w:rFonts w:ascii="Dubai" w:hAnsi="Dubai" w:cs="Dubai"/>
@@ -665,7 +799,18 @@
           <w:szCs w:val="18"/>
           <w:rtl/>
         </w:rPr>
-        <w:t>التوزيع الفعلي لشكاوى المتعاملين</w:t>
+        <w:t>التوزيع</w:t>
+      </w:r>
+      <w:proofErr w:type="gramEnd"/>
+      <w:r>
+        <w:rPr>
+          <w:rFonts w:ascii="Dubai" w:hAnsi="Dubai" w:cs="Dubai"/>
+          <w:color w:val="606060"/>
+          <w:sz w:val="18"/>
+          <w:szCs w:val="18"/>
+          <w:rtl/>
+        </w:rPr>
+        <w:t xml:space="preserve"> الفعلي لشكاوى المتعاملين</w:t>
       </w:r>
     </w:p>
     <w:p>
@@ -679,6 +824,7 @@
           <w:szCs w:val="18"/>
         </w:rPr>
       </w:pPr>
+      <w:proofErr w:type="gramStart"/>
       <w:r>
         <w:rPr>
           <w:rFonts w:ascii="Dubai" w:hAnsi="Dubai" w:cs="Dubai"/>
@@ -715,7 +861,18 @@
           <w:szCs w:val="18"/>
           <w:rtl/>
         </w:rPr>
-        <w:t>تحليل قنوات التقديم — 91% من الطلبات تصل عبر القنوات الرقمية</w:t>
+        <w:t>تحليل</w:t>
+      </w:r>
+      <w:proofErr w:type="gramEnd"/>
+      <w:r>
+        <w:rPr>
+          <w:rFonts w:ascii="Dubai" w:hAnsi="Dubai" w:cs="Dubai"/>
+          <w:color w:val="606060"/>
+          <w:sz w:val="18"/>
+          <w:szCs w:val="18"/>
+          <w:rtl/>
+        </w:rPr>
+        <w:t xml:space="preserve"> قنوات التقديم — 91% من الطلبات تصل عبر القنوات الرقمية</w:t>
       </w:r>
     </w:p>
     <w:p>
@@ -729,6 +886,7 @@
           <w:szCs w:val="18"/>
         </w:rPr>
       </w:pPr>
+      <w:proofErr w:type="gramStart"/>
       <w:r>
         <w:rPr>
           <w:rFonts w:ascii="Dubai" w:hAnsi="Dubai" w:cs="Dubai"/>
@@ -765,7 +923,18 @@
           <w:szCs w:val="18"/>
           <w:rtl/>
         </w:rPr>
-        <w:t>تحليل رد المعالجة — الرفض والقبول والتكرار</w:t>
+        <w:t>تحليل</w:t>
+      </w:r>
+      <w:proofErr w:type="gramEnd"/>
+      <w:r>
+        <w:rPr>
+          <w:rFonts w:ascii="Dubai" w:hAnsi="Dubai" w:cs="Dubai"/>
+          <w:color w:val="606060"/>
+          <w:sz w:val="18"/>
+          <w:szCs w:val="18"/>
+          <w:rtl/>
+        </w:rPr>
+        <w:t xml:space="preserve"> رد المعالجة — الرفض والقبول والتكرار</w:t>
       </w:r>
     </w:p>
     <w:p>
@@ -779,6 +948,7 @@
           <w:szCs w:val="18"/>
         </w:rPr>
       </w:pPr>
+      <w:proofErr w:type="gramStart"/>
       <w:r>
         <w:rPr>
           <w:rFonts w:ascii="Dubai" w:hAnsi="Dubai" w:cs="Dubai"/>
@@ -815,7 +985,18 @@
           <w:szCs w:val="18"/>
           <w:rtl/>
         </w:rPr>
-        <w:t>توزيع الطلبات الواردة حسب الإدارات</w:t>
+        <w:t>توزيع</w:t>
+      </w:r>
+      <w:proofErr w:type="gramEnd"/>
+      <w:r>
+        <w:rPr>
+          <w:rFonts w:ascii="Dubai" w:hAnsi="Dubai" w:cs="Dubai"/>
+          <w:color w:val="606060"/>
+          <w:sz w:val="18"/>
+          <w:szCs w:val="18"/>
+          <w:rtl/>
+        </w:rPr>
+        <w:t xml:space="preserve"> الطلبات الواردة حسب الإدارات</w:t>
       </w:r>
     </w:p>
     <w:p>
@@ -901,6 +1082,7 @@
           <w:szCs w:val="18"/>
         </w:rPr>
       </w:pPr>
+      <w:proofErr w:type="gramStart"/>
       <w:r>
         <w:rPr>
           <w:rFonts w:ascii="Dubai" w:hAnsi="Dubai" w:cs="Dubai"/>
@@ -937,7 +1119,18 @@
           <w:szCs w:val="18"/>
           <w:rtl/>
         </w:rPr>
-        <w:t>جدول الفجوات المُدمج — ربط الشكاوى بالقنوات الرسمية</w:t>
+        <w:t>جدول</w:t>
+      </w:r>
+      <w:proofErr w:type="gramEnd"/>
+      <w:r>
+        <w:rPr>
+          <w:rFonts w:ascii="Dubai" w:hAnsi="Dubai" w:cs="Dubai"/>
+          <w:color w:val="606060"/>
+          <w:sz w:val="18"/>
+          <w:szCs w:val="18"/>
+          <w:rtl/>
+        </w:rPr>
+        <w:t xml:space="preserve"> الفجوات المُدمج — ربط الشكاوى بالقنوات الرسمية</w:t>
       </w:r>
     </w:p>
     <w:p>
@@ -951,6 +1144,7 @@
           <w:szCs w:val="18"/>
         </w:rPr>
       </w:pPr>
+      <w:proofErr w:type="gramStart"/>
       <w:r>
         <w:rPr>
           <w:rFonts w:ascii="Dubai" w:hAnsi="Dubai" w:cs="Dubai"/>
@@ -987,7 +1181,18 @@
           <w:szCs w:val="18"/>
           <w:rtl/>
         </w:rPr>
-        <w:t>الأسباب الجذرية لاستمرار المشكلات</w:t>
+        <w:t>الأسباب</w:t>
+      </w:r>
+      <w:proofErr w:type="gramEnd"/>
+      <w:r>
+        <w:rPr>
+          <w:rFonts w:ascii="Dubai" w:hAnsi="Dubai" w:cs="Dubai"/>
+          <w:color w:val="606060"/>
+          <w:sz w:val="18"/>
+          <w:szCs w:val="18"/>
+          <w:rtl/>
+        </w:rPr>
+        <w:t xml:space="preserve"> الجذرية لاستمرار المشكلات</w:t>
       </w:r>
     </w:p>
     <w:p>
@@ -1047,6 +1252,7 @@
           <w:szCs w:val="18"/>
         </w:rPr>
       </w:pPr>
+      <w:proofErr w:type="gramStart"/>
       <w:r>
         <w:rPr>
           <w:rFonts w:ascii="Dubai" w:hAnsi="Dubai" w:cs="Dubai"/>
@@ -1083,7 +1289,18 @@
           <w:szCs w:val="18"/>
           <w:rtl/>
         </w:rPr>
-        <w:t>الأسئلة الشائعة ذات الأولوية (6 أسئلة)</w:t>
+        <w:t>الأسئلة</w:t>
+      </w:r>
+      <w:proofErr w:type="gramEnd"/>
+      <w:r>
+        <w:rPr>
+          <w:rFonts w:ascii="Dubai" w:hAnsi="Dubai" w:cs="Dubai"/>
+          <w:color w:val="606060"/>
+          <w:sz w:val="18"/>
+          <w:szCs w:val="18"/>
+          <w:rtl/>
+        </w:rPr>
+        <w:t xml:space="preserve"> الشائعة ذات الأولوية (6 أسئلة)</w:t>
       </w:r>
     </w:p>
     <w:p>
@@ -1097,6 +1314,7 @@
           <w:szCs w:val="18"/>
         </w:rPr>
       </w:pPr>
+      <w:proofErr w:type="gramStart"/>
       <w:r>
         <w:rPr>
           <w:rFonts w:ascii="Dubai" w:hAnsi="Dubai" w:cs="Dubai"/>
@@ -1133,7 +1351,18 @@
           <w:szCs w:val="18"/>
           <w:rtl/>
         </w:rPr>
-        <w:t>مسار إلغاء 55+ حالة شكوى بالإشعار الاستباقي</w:t>
+        <w:t>مسار</w:t>
+      </w:r>
+      <w:proofErr w:type="gramEnd"/>
+      <w:r>
+        <w:rPr>
+          <w:rFonts w:ascii="Dubai" w:hAnsi="Dubai" w:cs="Dubai"/>
+          <w:color w:val="606060"/>
+          <w:sz w:val="18"/>
+          <w:szCs w:val="18"/>
+          <w:rtl/>
+        </w:rPr>
+        <w:t xml:space="preserve"> إلغاء 55+ حالة شكوى بالإشعار الاستباقي</w:t>
       </w:r>
     </w:p>
     <w:p>
@@ -1348,7 +1577,6 @@
           <w:szCs w:val="32"/>
           <w:rtl/>
         </w:rPr>
-        <w:lastRenderedPageBreak/>
         <w:t xml:space="preserve">أولاً: الملخص التنفيذي — </w:t>
       </w:r>
       <w:r>
@@ -2536,7 +2764,29 @@
           <w:szCs w:val="20"/>
           <w:rtl/>
         </w:rPr>
-        <w:t xml:space="preserve">تكشف بيانات الشكاوى أن التحدي ليس في غياب القنوات الرقمية — إذ تتوفر تطبيق وزارة الداخلية وتطبيق شرطة الفجيرة لمعظم الخدمات — بل في ثلاثة معوِّقات: </w:t>
+        <w:t xml:space="preserve">تكشف بيانات الشكاوى أن التحدي ليس في غياب القنوات الرقمية — إذ تتوفر تطبيق وزارة الداخلية وتطبيق شرطة الفجيرة لمعظم الخدمات — بل في </w:t>
+      </w:r>
+      <w:proofErr w:type="gramStart"/>
+      <w:r>
+        <w:rPr>
+          <w:rFonts w:ascii="Dubai" w:hAnsi="Dubai" w:cs="Dubai"/>
+          <w:color w:val="404040"/>
+          <w:sz w:val="20"/>
+          <w:szCs w:val="20"/>
+          <w:rtl/>
+        </w:rPr>
+        <w:t>ثلاثة</w:t>
+      </w:r>
+      <w:proofErr w:type="gramEnd"/>
+      <w:r>
+        <w:rPr>
+          <w:rFonts w:ascii="Dubai" w:hAnsi="Dubai" w:cs="Dubai"/>
+          <w:color w:val="404040"/>
+          <w:sz w:val="20"/>
+          <w:szCs w:val="20"/>
+          <w:rtl/>
+        </w:rPr>
+        <w:t xml:space="preserve"> معوِّقات: </w:t>
       </w:r>
       <w:r>
         <w:rPr>
@@ -3778,7 +4028,7 @@
             <wp:cNvGraphicFramePr/>
             <a:graphic xmlns:a="http://schemas.openxmlformats.org/drawingml/2006/main">
               <a:graphicData uri="http://schemas.openxmlformats.org/drawingml/2006/chart">
-                <c:chart xmlns:c="http://schemas.openxmlformats.org/drawingml/2006/chart" xmlns:r="http://schemas.openxmlformats.org/officeDocument/2006/relationships" r:id="rId7"/>
+                <c:chart xmlns:c="http://schemas.openxmlformats.org/drawingml/2006/chart" xmlns:r="http://schemas.openxmlformats.org/officeDocument/2006/relationships" r:id="rId8"/>
               </a:graphicData>
             </a:graphic>
           </wp:inline>
@@ -3833,7 +4083,7 @@
             <wp:cNvGraphicFramePr/>
             <a:graphic xmlns:a="http://schemas.openxmlformats.org/drawingml/2006/main">
               <a:graphicData uri="http://schemas.openxmlformats.org/drawingml/2006/chart">
-                <c:chart xmlns:c="http://schemas.openxmlformats.org/drawingml/2006/chart" xmlns:r="http://schemas.openxmlformats.org/officeDocument/2006/relationships" r:id="rId8"/>
+                <c:chart xmlns:c="http://schemas.openxmlformats.org/drawingml/2006/chart" xmlns:r="http://schemas.openxmlformats.org/officeDocument/2006/relationships" r:id="rId9"/>
               </a:graphicData>
             </a:graphic>
             <wp14:sizeRelH relativeFrom="page">
@@ -3880,7 +4130,7 @@
             <wp:cNvGraphicFramePr/>
             <a:graphic xmlns:a="http://schemas.openxmlformats.org/drawingml/2006/main">
               <a:graphicData uri="http://schemas.openxmlformats.org/drawingml/2006/chart">
-                <c:chart xmlns:c="http://schemas.openxmlformats.org/drawingml/2006/chart" xmlns:r="http://schemas.openxmlformats.org/officeDocument/2006/relationships" r:id="rId9"/>
+                <c:chart xmlns:c="http://schemas.openxmlformats.org/drawingml/2006/chart" xmlns:r="http://schemas.openxmlformats.org/officeDocument/2006/relationships" r:id="rId10"/>
               </a:graphicData>
             </a:graphic>
             <wp14:sizeRelH relativeFrom="page">
@@ -3910,7 +4160,7 @@
             <wp:cNvGraphicFramePr/>
             <a:graphic xmlns:a="http://schemas.openxmlformats.org/drawingml/2006/main">
               <a:graphicData uri="http://schemas.openxmlformats.org/drawingml/2006/chart">
-                <c:chart xmlns:c="http://schemas.openxmlformats.org/drawingml/2006/chart" xmlns:r="http://schemas.openxmlformats.org/officeDocument/2006/relationships" r:id="rId10"/>
+                <c:chart xmlns:c="http://schemas.openxmlformats.org/drawingml/2006/chart" xmlns:r="http://schemas.openxmlformats.org/officeDocument/2006/relationships" r:id="rId11"/>
               </a:graphicData>
             </a:graphic>
           </wp:inline>
@@ -7524,7 +7774,29 @@
                 <w:szCs w:val="19"/>
                 <w:rtl/>
               </w:rPr>
-              <w:t>مخالفات شارقة / عُمان / أبوظبي أو اختصاص النيابة والبلدية</w:t>
+              <w:t xml:space="preserve">مخالفات شارقة / عُمان / </w:t>
+            </w:r>
+            <w:proofErr w:type="gramStart"/>
+            <w:r>
+              <w:rPr>
+                <w:rFonts w:ascii="Dubai" w:eastAsia="Times New Roman" w:hAnsi="Dubai" w:cs="Dubai" w:hint="cs"/>
+                <w:color w:val="000000"/>
+                <w:sz w:val="19"/>
+                <w:szCs w:val="19"/>
+                <w:rtl/>
+              </w:rPr>
+              <w:t>أبوظبي</w:t>
+            </w:r>
+            <w:proofErr w:type="gramEnd"/>
+            <w:r>
+              <w:rPr>
+                <w:rFonts w:ascii="Dubai" w:eastAsia="Times New Roman" w:hAnsi="Dubai" w:cs="Dubai" w:hint="cs"/>
+                <w:color w:val="000000"/>
+                <w:sz w:val="19"/>
+                <w:szCs w:val="19"/>
+                <w:rtl/>
+              </w:rPr>
+              <w:t xml:space="preserve"> أو اختصاص النيابة والبلدية</w:t>
             </w:r>
           </w:p>
         </w:tc>
@@ -10334,7 +10606,29 @@
           <w:szCs w:val="20"/>
           <w:rtl/>
         </w:rPr>
-        <w:t>. المتعامل لا يُكرِّر لأنه متذمِّر، بل لأنه لا يعرف إن كانت شكواه وصلت. هذا الإجراء وحده يُخفِّض الحجم الظاهر للشكاوى بمقدار يزيد على 16% فورياً.</w:t>
+        <w:t xml:space="preserve">. المتعامل لا يُكرِّر لأنه متذمِّر، بل لأنه لا يعرف </w:t>
+      </w:r>
+      <w:proofErr w:type="gramStart"/>
+      <w:r>
+        <w:rPr>
+          <w:rFonts w:ascii="Dubai" w:hAnsi="Dubai" w:cs="Dubai"/>
+          <w:color w:val="404040"/>
+          <w:sz w:val="20"/>
+          <w:szCs w:val="20"/>
+          <w:rtl/>
+        </w:rPr>
+        <w:t>إن</w:t>
+      </w:r>
+      <w:proofErr w:type="gramEnd"/>
+      <w:r>
+        <w:rPr>
+          <w:rFonts w:ascii="Dubai" w:hAnsi="Dubai" w:cs="Dubai"/>
+          <w:color w:val="404040"/>
+          <w:sz w:val="20"/>
+          <w:szCs w:val="20"/>
+          <w:rtl/>
+        </w:rPr>
+        <w:t xml:space="preserve"> كانت شكواه وصلت. هذا الإجراء وحده يُخفِّض الحجم الظاهر للشكاوى بمقدار يزيد على 16% فورياً.</w:t>
       </w:r>
     </w:p>
     <w:p>
@@ -19870,7 +20164,27 @@
                 <w:rtl/>
               </w:rPr>
               <w:br/>
-              <w:t>• إرسال إشعار تلقائي كل 7 أيام بتحديث الحالة حتى لو اقتصر على "قيد المعالجة"</w:t>
+              <w:t xml:space="preserve">• إرسال إشعار تلقائي كل 7 أيام بتحديث </w:t>
+            </w:r>
+            <w:proofErr w:type="gramStart"/>
+            <w:r>
+              <w:rPr>
+                <w:rFonts w:ascii="Dubai" w:hAnsi="Dubai" w:cs="Dubai"/>
+                <w:sz w:val="18"/>
+                <w:szCs w:val="18"/>
+                <w:rtl/>
+              </w:rPr>
+              <w:t>الحالة</w:t>
+            </w:r>
+            <w:proofErr w:type="gramEnd"/>
+            <w:r>
+              <w:rPr>
+                <w:rFonts w:ascii="Dubai" w:hAnsi="Dubai" w:cs="Dubai"/>
+                <w:sz w:val="18"/>
+                <w:szCs w:val="18"/>
+                <w:rtl/>
+              </w:rPr>
+              <w:t xml:space="preserve"> حتى لو اقتصر على "قيد المعالجة"</w:t>
             </w:r>
             <w:r>
               <w:rPr>
@@ -20306,7 +20620,27 @@
                 <w:szCs w:val="18"/>
                 <w:rtl/>
               </w:rPr>
-              <w:t>تقدمت بطلب ولم يُرد علي ضمن المدة المحددة</w:t>
+              <w:t xml:space="preserve">تقدمت بطلب ولم يُرد </w:t>
+            </w:r>
+            <w:proofErr w:type="gramStart"/>
+            <w:r>
+              <w:rPr>
+                <w:rFonts w:ascii="Dubai" w:hAnsi="Dubai" w:cs="Dubai"/>
+                <w:sz w:val="18"/>
+                <w:szCs w:val="18"/>
+                <w:rtl/>
+              </w:rPr>
+              <w:t>علي</w:t>
+            </w:r>
+            <w:proofErr w:type="gramEnd"/>
+            <w:r>
+              <w:rPr>
+                <w:rFonts w:ascii="Dubai" w:hAnsi="Dubai" w:cs="Dubai"/>
+                <w:sz w:val="18"/>
+                <w:szCs w:val="18"/>
+                <w:rtl/>
+              </w:rPr>
+              <w:t xml:space="preserve"> ضمن المدة المحددة</w:t>
             </w:r>
           </w:p>
         </w:tc>
@@ -21689,8 +22023,12 @@
       </w:pPr>
     </w:p>
     <w:sectPr>
-      <w:headerReference w:type="default" r:id="rId11"/>
-      <w:footerReference w:type="default" r:id="rId12"/>
+      <w:headerReference w:type="even" r:id="rId12"/>
+      <w:headerReference w:type="default" r:id="rId13"/>
+      <w:footerReference w:type="even" r:id="rId14"/>
+      <w:footerReference w:type="default" r:id="rId15"/>
+      <w:headerReference w:type="first" r:id="rId16"/>
+      <w:footerReference w:type="first" r:id="rId17"/>
       <w:pgSz w:w="12240" w:h="15840"/>
       <w:pgMar w:top="1440" w:right="1440" w:bottom="1440" w:left="1440" w:header="720" w:footer="720" w:gutter="0"/>
       <w:cols w:space="720"/>
@@ -21720,6 +22058,16 @@
 </file>
 
 <file path=word/footer1.xml><?xml version="1.0" encoding="utf-8"?>
+<w:ftr xmlns:wpc="http://schemas.microsoft.com/office/word/2010/wordprocessingCanvas" xmlns:cx="http://schemas.microsoft.com/office/drawing/2014/chartex" xmlns:cx1="http://schemas.microsoft.com/office/drawing/2015/9/8/chartex" xmlns:cx2="http://schemas.microsoft.com/office/drawing/2015/10/21/chartex" xmlns:cx3="http://schemas.microsoft.com/office/drawing/2016/5/9/chartex" xmlns:cx4="http://schemas.microsoft.com/office/drawing/2016/5/10/chartex" xmlns:cx5="http://schemas.microsoft.com/office/drawing/2016/5/11/chartex" xmlns:cx6="http://schemas.microsoft.com/office/drawing/2016/5/12/chartex" xmlns:cx7="http://schemas.microsoft.com/office/drawing/2016/5/13/chartex" xmlns:cx8="http://schemas.microsoft.com/office/drawing/2016/5/14/chartex" xmlns:mc="http://schemas.openxmlformats.org/markup-compatibility/2006" xmlns:aink="http://schemas.microsoft.com/office/drawing/2016/ink" xmlns:am3d="http://schemas.microsoft.com/office/drawing/2017/model3d" xmlns:o="urn:schemas-microsoft-com:office:office" xmlns:oel="http://schemas.microsoft.com/office/2019/extlst" xmlns:r="http://schemas.openxmlformats.org/officeDocument/2006/relationships" xmlns:m="http://schemas.openxmlformats.org/officeDocument/2006/math" xmlns:v="urn:schemas-microsoft-com:vml" xmlns:wp14="http://schemas.microsoft.com/office/word/2010/wordprocessingDrawing" xmlns:wp="http://schemas.openxmlformats.org/drawingml/2006/wordprocessingDrawing" xmlns:w10="urn:schemas-microsoft-com:office:word" xmlns:w="http://schemas.openxmlformats.org/wordprocessingml/2006/main" xmlns:w14="http://schemas.microsoft.com/office/word/2010/wordml" xmlns:w15="http://schemas.microsoft.com/office/word/2012/wordml" xmlns:w16cex="http://schemas.microsoft.com/office/word/2018/wordml/cex" xmlns:w16cid="http://schemas.microsoft.com/office/word/2016/wordml/cid" xmlns:w16="http://schemas.microsoft.com/office/word/2018/wordml" xmlns:w16du="http://schemas.microsoft.com/office/word/2023/wordml/word16du" xmlns:w16sdtdh="http://schemas.microsoft.com/office/word/2020/wordml/sdtdatahash" xmlns:w16sdtfl="http://schemas.microsoft.com/office/word/2024/wordml/sdtformatlock" xmlns:w16se="http://schemas.microsoft.com/office/word/2015/wordml/symex" xmlns:wpg="http://schemas.microsoft.com/office/word/2010/wordprocessingGroup" xmlns:wpi="http://schemas.microsoft.com/office/word/2010/wordprocessingInk" xmlns:wne="http://schemas.microsoft.com/office/word/2006/wordml" xmlns:wps="http://schemas.microsoft.com/office/word/2010/wordprocessingShape" mc:Ignorable="w14 w15 w16se w16cid w16 w16cex w16sdtdh w16sdtfl w16du wp14">
+  <w:p>
+    <w:pPr>
+      <w:pStyle w:val="Footer"/>
+    </w:pPr>
+  </w:p>
+</w:ftr>
+</file>
+
+<file path=word/footer2.xml><?xml version="1.0" encoding="utf-8"?>
 <w:ftr xmlns:wpc="http://schemas.microsoft.com/office/word/2010/wordprocessingCanvas" xmlns:cx="http://schemas.microsoft.com/office/drawing/2014/chartex" xmlns:cx1="http://schemas.microsoft.com/office/drawing/2015/9/8/chartex" xmlns:cx2="http://schemas.microsoft.com/office/drawing/2015/10/21/chartex" xmlns:cx3="http://schemas.microsoft.com/office/drawing/2016/5/9/chartex" xmlns:cx4="http://schemas.microsoft.com/office/drawing/2016/5/10/chartex" xmlns:cx5="http://schemas.microsoft.com/office/drawing/2016/5/11/chartex" xmlns:cx6="http://schemas.microsoft.com/office/drawing/2016/5/12/chartex" xmlns:cx7="http://schemas.microsoft.com/office/drawing/2016/5/13/chartex" xmlns:cx8="http://schemas.microsoft.com/office/drawing/2016/5/14/chartex" xmlns:mc="http://schemas.openxmlformats.org/markup-compatibility/2006" xmlns:aink="http://schemas.microsoft.com/office/drawing/2016/ink" xmlns:am3d="http://schemas.microsoft.com/office/drawing/2017/model3d" xmlns:o="urn:schemas-microsoft-com:office:office" xmlns:oel="http://schemas.microsoft.com/office/2019/extlst" xmlns:r="http://schemas.openxmlformats.org/officeDocument/2006/relationships" xmlns:m="http://schemas.openxmlformats.org/officeDocument/2006/math" xmlns:v="urn:schemas-microsoft-com:vml" xmlns:wp14="http://schemas.microsoft.com/office/word/2010/wordprocessingDrawing" xmlns:wp="http://schemas.openxmlformats.org/drawingml/2006/wordprocessingDrawing" xmlns:w10="urn:schemas-microsoft-com:office:word" xmlns:w="http://schemas.openxmlformats.org/wordprocessingml/2006/main" xmlns:w14="http://schemas.microsoft.com/office/word/2010/wordml" xmlns:w15="http://schemas.microsoft.com/office/word/2012/wordml" xmlns:w16cex="http://schemas.microsoft.com/office/word/2018/wordml/cex" xmlns:w16cid="http://schemas.microsoft.com/office/word/2016/wordml/cid" xmlns:w16="http://schemas.microsoft.com/office/word/2018/wordml" xmlns:w16du="http://schemas.microsoft.com/office/word/2023/wordml/word16du" xmlns:w16sdtdh="http://schemas.microsoft.com/office/word/2020/wordml/sdtdatahash" xmlns:w16sdtfl="http://schemas.microsoft.com/office/word/2024/wordml/sdtformatlock" xmlns:w16se="http://schemas.microsoft.com/office/word/2015/wordml/symex" xmlns:wpg="http://schemas.microsoft.com/office/word/2010/wordprocessingGroup" xmlns:wpi="http://schemas.microsoft.com/office/word/2010/wordprocessingInk" xmlns:wne="http://schemas.microsoft.com/office/word/2006/wordml" xmlns:wps="http://schemas.microsoft.com/office/word/2010/wordprocessingShape" mc:Ignorable="w14 w15 w16se w16cid w16 w16cex w16sdtdh w16sdtfl w16du wp14">
   <w:p>
     <w:pPr>
@@ -21804,6 +22152,16 @@
 </w:ftr>
 </file>
 
+<file path=word/footer3.xml><?xml version="1.0" encoding="utf-8"?>
+<w:ftr xmlns:wpc="http://schemas.microsoft.com/office/word/2010/wordprocessingCanvas" xmlns:cx="http://schemas.microsoft.com/office/drawing/2014/chartex" xmlns:cx1="http://schemas.microsoft.com/office/drawing/2015/9/8/chartex" xmlns:cx2="http://schemas.microsoft.com/office/drawing/2015/10/21/chartex" xmlns:cx3="http://schemas.microsoft.com/office/drawing/2016/5/9/chartex" xmlns:cx4="http://schemas.microsoft.com/office/drawing/2016/5/10/chartex" xmlns:cx5="http://schemas.microsoft.com/office/drawing/2016/5/11/chartex" xmlns:cx6="http://schemas.microsoft.com/office/drawing/2016/5/12/chartex" xmlns:cx7="http://schemas.microsoft.com/office/drawing/2016/5/13/chartex" xmlns:cx8="http://schemas.microsoft.com/office/drawing/2016/5/14/chartex" xmlns:mc="http://schemas.openxmlformats.org/markup-compatibility/2006" xmlns:aink="http://schemas.microsoft.com/office/drawing/2016/ink" xmlns:am3d="http://schemas.microsoft.com/office/drawing/2017/model3d" xmlns:o="urn:schemas-microsoft-com:office:office" xmlns:oel="http://schemas.microsoft.com/office/2019/extlst" xmlns:r="http://schemas.openxmlformats.org/officeDocument/2006/relationships" xmlns:m="http://schemas.openxmlformats.org/officeDocument/2006/math" xmlns:v="urn:schemas-microsoft-com:vml" xmlns:wp14="http://schemas.microsoft.com/office/word/2010/wordprocessingDrawing" xmlns:wp="http://schemas.openxmlformats.org/drawingml/2006/wordprocessingDrawing" xmlns:w10="urn:schemas-microsoft-com:office:word" xmlns:w="http://schemas.openxmlformats.org/wordprocessingml/2006/main" xmlns:w14="http://schemas.microsoft.com/office/word/2010/wordml" xmlns:w15="http://schemas.microsoft.com/office/word/2012/wordml" xmlns:w16cex="http://schemas.microsoft.com/office/word/2018/wordml/cex" xmlns:w16cid="http://schemas.microsoft.com/office/word/2016/wordml/cid" xmlns:w16="http://schemas.microsoft.com/office/word/2018/wordml" xmlns:w16du="http://schemas.microsoft.com/office/word/2023/wordml/word16du" xmlns:w16sdtdh="http://schemas.microsoft.com/office/word/2020/wordml/sdtdatahash" xmlns:w16sdtfl="http://schemas.microsoft.com/office/word/2024/wordml/sdtformatlock" xmlns:w16se="http://schemas.microsoft.com/office/word/2015/wordml/symex" xmlns:wpg="http://schemas.microsoft.com/office/word/2010/wordprocessingGroup" xmlns:wpi="http://schemas.microsoft.com/office/word/2010/wordprocessingInk" xmlns:wne="http://schemas.microsoft.com/office/word/2006/wordml" xmlns:wps="http://schemas.microsoft.com/office/word/2010/wordprocessingShape" mc:Ignorable="w14 w15 w16se w16cid w16 w16cex w16sdtdh w16sdtfl w16du wp14">
+  <w:p>
+    <w:pPr>
+      <w:pStyle w:val="Footer"/>
+    </w:pPr>
+  </w:p>
+</w:ftr>
+</file>
+
 <file path=word/footnotes.xml><?xml version="1.0" encoding="utf-8"?>
 <w:footnotes xmlns:wpc="http://schemas.microsoft.com/office/word/2010/wordprocessingCanvas" xmlns:cx="http://schemas.microsoft.com/office/drawing/2014/chartex" xmlns:cx1="http://schemas.microsoft.com/office/drawing/2015/9/8/chartex" xmlns:cx2="http://schemas.microsoft.com/office/drawing/2015/10/21/chartex" xmlns:cx3="http://schemas.microsoft.com/office/drawing/2016/5/9/chartex" xmlns:cx4="http://schemas.microsoft.com/office/drawing/2016/5/10/chartex" xmlns:cx5="http://schemas.microsoft.com/office/drawing/2016/5/11/chartex" xmlns:cx6="http://schemas.microsoft.com/office/drawing/2016/5/12/chartex" xmlns:cx7="http://schemas.microsoft.com/office/drawing/2016/5/13/chartex" xmlns:cx8="http://schemas.microsoft.com/office/drawing/2016/5/14/chartex" xmlns:mc="http://schemas.openxmlformats.org/markup-compatibility/2006" xmlns:aink="http://schemas.microsoft.com/office/drawing/2016/ink" xmlns:am3d="http://schemas.microsoft.com/office/drawing/2017/model3d" xmlns:o="urn:schemas-microsoft-com:office:office" xmlns:oel="http://schemas.microsoft.com/office/2019/extlst" xmlns:r="http://schemas.openxmlformats.org/officeDocument/2006/relationships" xmlns:m="http://schemas.openxmlformats.org/officeDocument/2006/math" xmlns:v="urn:schemas-microsoft-com:vml" xmlns:wp14="http://schemas.microsoft.com/office/word/2010/wordprocessingDrawing" xmlns:wp="http://schemas.openxmlformats.org/drawingml/2006/wordprocessingDrawing" xmlns:w10="urn:schemas-microsoft-com:office:word" xmlns:w="http://schemas.openxmlformats.org/wordprocessingml/2006/main" xmlns:w14="http://schemas.microsoft.com/office/word/2010/wordml" xmlns:w15="http://schemas.microsoft.com/office/word/2012/wordml" xmlns:w16cex="http://schemas.microsoft.com/office/word/2018/wordml/cex" xmlns:w16cid="http://schemas.microsoft.com/office/word/2016/wordml/cid" xmlns:w16="http://schemas.microsoft.com/office/word/2018/wordml" xmlns:w16du="http://schemas.microsoft.com/office/word/2023/wordml/word16du" xmlns:w16sdtdh="http://schemas.microsoft.com/office/word/2020/wordml/sdtdatahash" xmlns:w16sdtfl="http://schemas.microsoft.com/office/word/2024/wordml/sdtformatlock" xmlns:w16se="http://schemas.microsoft.com/office/word/2015/wordml/symex" xmlns:wpg="http://schemas.microsoft.com/office/word/2010/wordprocessingGroup" xmlns:wpi="http://schemas.microsoft.com/office/word/2010/wordprocessingInk" xmlns:wne="http://schemas.microsoft.com/office/word/2006/wordml" xmlns:wps="http://schemas.microsoft.com/office/word/2010/wordprocessingShape" mc:Ignorable="w14 w15 w16se w16cid w16 w16cex w16sdtdh w16sdtfl w16du wp14">
   <w:footnote w:type="separator" w:id="-1">
@@ -21827,6 +22185,16 @@
 <w:hdr xmlns:wpc="http://schemas.microsoft.com/office/word/2010/wordprocessingCanvas" xmlns:cx="http://schemas.microsoft.com/office/drawing/2014/chartex" xmlns:cx1="http://schemas.microsoft.com/office/drawing/2015/9/8/chartex" xmlns:cx2="http://schemas.microsoft.com/office/drawing/2015/10/21/chartex" xmlns:cx3="http://schemas.microsoft.com/office/drawing/2016/5/9/chartex" xmlns:cx4="http://schemas.microsoft.com/office/drawing/2016/5/10/chartex" xmlns:cx5="http://schemas.microsoft.com/office/drawing/2016/5/11/chartex" xmlns:cx6="http://schemas.microsoft.com/office/drawing/2016/5/12/chartex" xmlns:cx7="http://schemas.microsoft.com/office/drawing/2016/5/13/chartex" xmlns:cx8="http://schemas.microsoft.com/office/drawing/2016/5/14/chartex" xmlns:mc="http://schemas.openxmlformats.org/markup-compatibility/2006" xmlns:aink="http://schemas.microsoft.com/office/drawing/2016/ink" xmlns:am3d="http://schemas.microsoft.com/office/drawing/2017/model3d" xmlns:o="urn:schemas-microsoft-com:office:office" xmlns:oel="http://schemas.microsoft.com/office/2019/extlst" xmlns:r="http://schemas.openxmlformats.org/officeDocument/2006/relationships" xmlns:m="http://schemas.openxmlformats.org/officeDocument/2006/math" xmlns:v="urn:schemas-microsoft-com:vml" xmlns:wp14="http://schemas.microsoft.com/office/word/2010/wordprocessingDrawing" xmlns:wp="http://schemas.openxmlformats.org/drawingml/2006/wordprocessingDrawing" xmlns:w10="urn:schemas-microsoft-com:office:word" xmlns:w="http://schemas.openxmlformats.org/wordprocessingml/2006/main" xmlns:w14="http://schemas.microsoft.com/office/word/2010/wordml" xmlns:w15="http://schemas.microsoft.com/office/word/2012/wordml" xmlns:w16cex="http://schemas.microsoft.com/office/word/2018/wordml/cex" xmlns:w16cid="http://schemas.microsoft.com/office/word/2016/wordml/cid" xmlns:w16="http://schemas.microsoft.com/office/word/2018/wordml" xmlns:w16du="http://schemas.microsoft.com/office/word/2023/wordml/word16du" xmlns:w16sdtdh="http://schemas.microsoft.com/office/word/2020/wordml/sdtdatahash" xmlns:w16sdtfl="http://schemas.microsoft.com/office/word/2024/wordml/sdtformatlock" xmlns:w16se="http://schemas.microsoft.com/office/word/2015/wordml/symex" xmlns:wpg="http://schemas.microsoft.com/office/word/2010/wordprocessingGroup" xmlns:wpi="http://schemas.microsoft.com/office/word/2010/wordprocessingInk" xmlns:wne="http://schemas.microsoft.com/office/word/2006/wordml" xmlns:wps="http://schemas.microsoft.com/office/word/2010/wordprocessingShape" mc:Ignorable="w14 w15 w16se w16cid w16 w16cex w16sdtdh w16sdtfl w16du wp14">
   <w:p>
     <w:pPr>
+      <w:pStyle w:val="Header"/>
+    </w:pPr>
+  </w:p>
+</w:hdr>
+</file>
+
+<file path=word/header2.xml><?xml version="1.0" encoding="utf-8"?>
+<w:hdr xmlns:wpc="http://schemas.microsoft.com/office/word/2010/wordprocessingCanvas" xmlns:cx="http://schemas.microsoft.com/office/drawing/2014/chartex" xmlns:cx1="http://schemas.microsoft.com/office/drawing/2015/9/8/chartex" xmlns:cx2="http://schemas.microsoft.com/office/drawing/2015/10/21/chartex" xmlns:cx3="http://schemas.microsoft.com/office/drawing/2016/5/9/chartex" xmlns:cx4="http://schemas.microsoft.com/office/drawing/2016/5/10/chartex" xmlns:cx5="http://schemas.microsoft.com/office/drawing/2016/5/11/chartex" xmlns:cx6="http://schemas.microsoft.com/office/drawing/2016/5/12/chartex" xmlns:cx7="http://schemas.microsoft.com/office/drawing/2016/5/13/chartex" xmlns:cx8="http://schemas.microsoft.com/office/drawing/2016/5/14/chartex" xmlns:mc="http://schemas.openxmlformats.org/markup-compatibility/2006" xmlns:aink="http://schemas.microsoft.com/office/drawing/2016/ink" xmlns:am3d="http://schemas.microsoft.com/office/drawing/2017/model3d" xmlns:o="urn:schemas-microsoft-com:office:office" xmlns:oel="http://schemas.microsoft.com/office/2019/extlst" xmlns:r="http://schemas.openxmlformats.org/officeDocument/2006/relationships" xmlns:m="http://schemas.openxmlformats.org/officeDocument/2006/math" xmlns:v="urn:schemas-microsoft-com:vml" xmlns:wp14="http://schemas.microsoft.com/office/word/2010/wordprocessingDrawing" xmlns:wp="http://schemas.openxmlformats.org/drawingml/2006/wordprocessingDrawing" xmlns:w10="urn:schemas-microsoft-com:office:word" xmlns:w="http://schemas.openxmlformats.org/wordprocessingml/2006/main" xmlns:w14="http://schemas.microsoft.com/office/word/2010/wordml" xmlns:w15="http://schemas.microsoft.com/office/word/2012/wordml" xmlns:w16cex="http://schemas.microsoft.com/office/word/2018/wordml/cex" xmlns:w16cid="http://schemas.microsoft.com/office/word/2016/wordml/cid" xmlns:w16="http://schemas.microsoft.com/office/word/2018/wordml" xmlns:w16du="http://schemas.microsoft.com/office/word/2023/wordml/word16du" xmlns:w16sdtdh="http://schemas.microsoft.com/office/word/2020/wordml/sdtdatahash" xmlns:w16sdtfl="http://schemas.microsoft.com/office/word/2024/wordml/sdtformatlock" xmlns:w16se="http://schemas.microsoft.com/office/word/2015/wordml/symex" xmlns:wpg="http://schemas.microsoft.com/office/word/2010/wordprocessingGroup" xmlns:wpi="http://schemas.microsoft.com/office/word/2010/wordprocessingInk" xmlns:wne="http://schemas.microsoft.com/office/word/2006/wordml" xmlns:wps="http://schemas.microsoft.com/office/word/2010/wordprocessingShape" mc:Ignorable="w14 w15 w16se w16cid w16 w16cex w16sdtdh w16sdtfl w16du wp14">
+  <w:p>
+    <w:pPr>
       <w:pBdr>
         <w:bottom w:val="single" w:sz="6" w:space="4" w:color="2E75B6"/>
       </w:pBdr>
@@ -21837,12 +22205,13 @@
       <w:spacing w:after="120"/>
       <w:rPr>
         <w:rFonts w:ascii="Dubai" w:hAnsi="Dubai" w:cs="Dubai"/>
+        <w:color w:val="B68A35"/>
       </w:rPr>
     </w:pPr>
     <w:r>
       <w:rPr>
         <w:rFonts w:ascii="Dubai" w:hAnsi="Dubai" w:cs="Dubai"/>
-        <w:color w:val="404040"/>
+        <w:color w:val="B68A35"/>
         <w:sz w:val="18"/>
         <w:szCs w:val="18"/>
         <w:rtl/>
@@ -21852,7 +22221,7 @@
     <w:r>
       <w:rPr>
         <w:rFonts w:ascii="Dubai" w:hAnsi="Dubai" w:cs="Dubai" w:hint="cs"/>
-        <w:color w:val="404040"/>
+        <w:color w:val="B68A35"/>
         <w:sz w:val="18"/>
         <w:szCs w:val="18"/>
         <w:rtl/>
@@ -21863,7 +22232,7 @@
     <w:r>
       <w:rPr>
         <w:rFonts w:ascii="Dubai" w:hAnsi="Dubai" w:cs="Dubai"/>
-        <w:color w:val="404040"/>
+        <w:color w:val="B68A35"/>
         <w:sz w:val="18"/>
         <w:szCs w:val="18"/>
         <w:rtl/>
@@ -21873,6 +22242,7 @@
     <w:r>
       <w:rPr>
         <w:rFonts w:ascii="Dubai" w:hAnsi="Dubai" w:cs="Dubai"/>
+        <w:color w:val="B68A35"/>
         <w:sz w:val="18"/>
         <w:szCs w:val="18"/>
       </w:rPr>
@@ -21881,6 +22251,7 @@
     <w:r>
       <w:rPr>
         <w:rFonts w:ascii="Dubai" w:hAnsi="Dubai" w:cs="Dubai"/>
+        <w:color w:val="B68A35"/>
         <w:sz w:val="18"/>
         <w:szCs w:val="18"/>
       </w:rPr>
@@ -21889,30 +22260,52 @@
     <w:r>
       <w:rPr>
         <w:rFonts w:ascii="Dubai" w:hAnsi="Dubai" w:cs="Dubai" w:hint="cs"/>
+        <w:color w:val="B68A35"/>
         <w:sz w:val="18"/>
         <w:szCs w:val="18"/>
         <w:rtl/>
       </w:rPr>
-      <w:t xml:space="preserve">                  </w:t>
+      <w:t xml:space="preserve"> </w:t>
     </w:r>
     <w:r>
       <w:rPr>
         <w:rFonts w:ascii="Dubai" w:hAnsi="Dubai" w:cs="Dubai"/>
+        <w:color w:val="B68A35"/>
         <w:sz w:val="18"/>
         <w:szCs w:val="18"/>
       </w:rPr>
-      <w:t xml:space="preserve">                                                                                                                              </w:t>
+      <w:t xml:space="preserve">                                                                                                    </w:t>
     </w:r>
     <w:r>
       <w:rPr>
         <w:rFonts w:ascii="Dubai" w:hAnsi="Dubai" w:cs="Dubai"/>
-        <w:color w:val="404040"/>
+        <w:color w:val="B68A35"/>
         <w:sz w:val="18"/>
         <w:szCs w:val="18"/>
         <w:rtl/>
       </w:rPr>
       <w:t>أبريل 2026</w:t>
     </w:r>
+    <w:r>
+      <w:rPr>
+        <w:rFonts w:ascii="Dubai" w:hAnsi="Dubai" w:cs="Dubai" w:hint="cs"/>
+        <w:color w:val="B68A35"/>
+        <w:sz w:val="18"/>
+        <w:szCs w:val="18"/>
+        <w:rtl/>
+      </w:rPr>
+      <w:t xml:space="preserve"> | القيادة العامة لشرطة الفجيرة</w:t>
+    </w:r>
+  </w:p>
+</w:hdr>
+</file>
+
+<file path=word/header3.xml><?xml version="1.0" encoding="utf-8"?>
+<w:hdr xmlns:wpc="http://schemas.microsoft.com/office/word/2010/wordprocessingCanvas" xmlns:cx="http://schemas.microsoft.com/office/drawing/2014/chartex" xmlns:cx1="http://schemas.microsoft.com/office/drawing/2015/9/8/chartex" xmlns:cx2="http://schemas.microsoft.com/office/drawing/2015/10/21/chartex" xmlns:cx3="http://schemas.microsoft.com/office/drawing/2016/5/9/chartex" xmlns:cx4="http://schemas.microsoft.com/office/drawing/2016/5/10/chartex" xmlns:cx5="http://schemas.microsoft.com/office/drawing/2016/5/11/chartex" xmlns:cx6="http://schemas.microsoft.com/office/drawing/2016/5/12/chartex" xmlns:cx7="http://schemas.microsoft.com/office/drawing/2016/5/13/chartex" xmlns:cx8="http://schemas.microsoft.com/office/drawing/2016/5/14/chartex" xmlns:mc="http://schemas.openxmlformats.org/markup-compatibility/2006" xmlns:aink="http://schemas.microsoft.com/office/drawing/2016/ink" xmlns:am3d="http://schemas.microsoft.com/office/drawing/2017/model3d" xmlns:o="urn:schemas-microsoft-com:office:office" xmlns:oel="http://schemas.microsoft.com/office/2019/extlst" xmlns:r="http://schemas.openxmlformats.org/officeDocument/2006/relationships" xmlns:m="http://schemas.openxmlformats.org/officeDocument/2006/math" xmlns:v="urn:schemas-microsoft-com:vml" xmlns:wp14="http://schemas.microsoft.com/office/word/2010/wordprocessingDrawing" xmlns:wp="http://schemas.openxmlformats.org/drawingml/2006/wordprocessingDrawing" xmlns:w10="urn:schemas-microsoft-com:office:word" xmlns:w="http://schemas.openxmlformats.org/wordprocessingml/2006/main" xmlns:w14="http://schemas.microsoft.com/office/word/2010/wordml" xmlns:w15="http://schemas.microsoft.com/office/word/2012/wordml" xmlns:w16cex="http://schemas.microsoft.com/office/word/2018/wordml/cex" xmlns:w16cid="http://schemas.microsoft.com/office/word/2016/wordml/cid" xmlns:w16="http://schemas.microsoft.com/office/word/2018/wordml" xmlns:w16du="http://schemas.microsoft.com/office/word/2023/wordml/word16du" xmlns:w16sdtdh="http://schemas.microsoft.com/office/word/2020/wordml/sdtdatahash" xmlns:w16sdtfl="http://schemas.microsoft.com/office/word/2024/wordml/sdtformatlock" xmlns:w16se="http://schemas.microsoft.com/office/word/2015/wordml/symex" xmlns:wpg="http://schemas.microsoft.com/office/word/2010/wordprocessingGroup" xmlns:wpi="http://schemas.microsoft.com/office/word/2010/wordprocessingInk" xmlns:wne="http://schemas.microsoft.com/office/word/2006/wordml" xmlns:wps="http://schemas.microsoft.com/office/word/2010/wordprocessingShape" mc:Ignorable="w14 w15 w16se w16cid w16 w16cex w16sdtdh w16sdtfl w16du wp14">
+  <w:p>
+    <w:pPr>
+      <w:pStyle w:val="Header"/>
+    </w:pPr>
   </w:p>
 </w:hdr>
 </file>

</xml_diff>